<commit_message>
Fixed upper/lower bounds and new parameters added v1
</commit_message>
<xml_diff>
--- a/docs/Adaptive_Autovacuum_Architecture_Guide.docx
+++ b/docs/Adaptive_Autovacuum_Architecture_Guide.docx
@@ -911,7 +911,7 @@
         <w:t>manage_global_settings</w:t>
       </w:r>
       <w:r>
-        <w:t xml:space="preserve"> is true; the GUC is on the C-side allowlist; the value passes numeric validation; the same GUC has not been changed within </w:t>
+        <w:t xml:space="preserve"> is true; the GUC is on the C-side allowlist; the value passes numeric validation; no pending change for it already exists; the new value actually differs numerically from the current one. There is deliberately no per-GUC cooldown: correlated settings must be able to move together (raising </w:t>
       </w:r>
       <w:r>
         <w:rPr>
@@ -919,10 +919,21 @@
           <w:color w:val="1F3B6E"/>
           <w:sz w:val="19"/>
         </w:rPr>
-        <w:t>global_change_cooldown_seconds</w:t>
-      </w:r>
-      <w:r>
-        <w:t>; no pending change for it already exists; the new value actually differs numerically from the current one.</w:t>
+        <w:t>autovacuum_max_workers</w:t>
+      </w:r>
+      <w:r>
+        <w:t xml:space="preserve"> alone splits the same </w:t>
+      </w:r>
+      <w:r>
+        <w:rPr>
+          <w:rFonts w:ascii="Consolas" w:hAnsi="Consolas"/>
+          <w:color w:val="1F3B6E"/>
+          <w:sz w:val="19"/>
+        </w:rPr>
+        <w:t>cost_limit</w:t>
+      </w:r>
+      <w:r>
+        <w:t xml:space="preserve"> across more workers, so the cost side must be able to follow on the next cycle). The naptime between cycles and the at-most-doubling step provide the pacing.</w:t>
       </w:r>
     </w:p>
     <w:p>
@@ -1694,7 +1705,7 @@
         <w:t>healthy_cycles_before_restore</w:t>
       </w:r>
       <w:r>
-        <w:t>. A per-relation cooldown prevents frequent tier changes; a per-GUC cooldown does the same for cluster settings. Changes are coarse and state-based rather than proportional on every sample, reducing oscillation.</w:t>
+        <w:t>. A per-relation cooldown prevents frequent tier changes; cluster settings are paced by the cycle naptime and the at-most-doubling step (see §10). Changes are coarse and state-based rather than proportional on every sample, reducing oscillation.</w:t>
       </w:r>
     </w:p>
     <w:p>
@@ -1748,7 +1759,56 @@
         <w:t>recommendation_cost_limit_max</w:t>
       </w:r>
       <w:r>
-        <w:t xml:space="preserve">) when long vacuums are delay-bound or relations are overdue without host pressure, and *reduced* under host pressure. Because the shared budget is split across workers, raising </w:t>
+        <w:t xml:space="preserve">) when long vacuums are delay-bound or relations are overdue without host pressure, and *reduced* under host pressure. The delay walk-down halves per window but stops at </w:t>
+      </w:r>
+      <w:r>
+        <w:rPr>
+          <w:rFonts w:ascii="Consolas" w:hAnsi="Consolas"/>
+          <w:color w:val="1F3B6E"/>
+          <w:sz w:val="19"/>
+        </w:rPr>
+        <w:t>recommendation_delay_min_ms</w:t>
+      </w:r>
+      <w:r>
+        <w:t xml:space="preserve"> (default 0.5 ms): delay 0 equals unthrottled manual-vacuum aggression and is never reached automatically, while an operator-chosen delay already below the floor is respected and never raised.</w:t>
+      </w:r>
+    </w:p>
+    <w:p>
+      <w:r>
+        <w:t xml:space="preserve">Two memory-side settings are sized opportunistically while maintenance is actually running and the host has free memory — an idle cluster is never retuned. </w:t>
+      </w:r>
+      <w:r>
+        <w:rPr>
+          <w:rFonts w:ascii="Consolas" w:hAnsi="Consolas"/>
+          <w:color w:val="1F3B6E"/>
+          <w:sz w:val="19"/>
+        </w:rPr>
+        <w:t>vacuum_buffer_usage_limit</w:t>
+      </w:r>
+      <w:r>
+        <w:t xml:space="preserve"> (PG16+, the shared_buffers ring a VACUUM/ANALYZE may occupy; an idle ring costs nothing) is at most doubled per cycle up to </w:t>
+      </w:r>
+      <w:r>
+        <w:rPr>
+          <w:rFonts w:ascii="Consolas" w:hAnsi="Consolas"/>
+          <w:color w:val="1F3B6E"/>
+          <w:sz w:val="19"/>
+        </w:rPr>
+        <w:t>recommendation_buffer_usage_limit_max_mb</w:t>
+      </w:r>
+      <w:r>
+        <w:t xml:space="preserve">, additionally bounded by the server's own silent 1/8-of-shared_buffers clamp divided across the worker pool so concurrent rings cannot crowd out the workload's cache; it is halved back toward the built-in default under host pressure, and an operator value of 0 ("no limit") is never touched. </w:t>
+      </w:r>
+      <w:r>
+        <w:rPr>
+          <w:rFonts w:ascii="Consolas" w:hAnsi="Consolas"/>
+          <w:color w:val="1F3B6E"/>
+          <w:sz w:val="19"/>
+        </w:rPr>
+        <w:t>autovacuum_work_mem</w:t>
+      </w:r>
+      <w:r>
+        <w:t xml:space="preserve"> keeps its evidence-based raise (repeated index passes = the vacuum ran out of dead-tuple memory) and additionally ratchets toward the free-memory-derived value while workers are running; it is never lowered without host pressure. Because the shared budget is split across workers, raising </w:t>
       </w:r>
       <w:r>
         <w:rPr>
@@ -1951,7 +2011,7 @@
         <w:t>Fixed allowlist</w:t>
       </w:r>
       <w:r>
-        <w:t>, enforced twice: the SQL policy only enqueues the eleven managed autovacuum GUCs, and the C applier independently rejects anything outside its compiled-in list.</w:t>
+        <w:t>, enforced twice: the SQL policy only enqueues the twelve managed maintenance GUCs, and the C applier independently rejects anything outside its compiled-in list.</w:t>
       </w:r>
     </w:p>
     <w:p>
@@ -1965,21 +2025,16 @@
         <w:t>Numeric validation</w:t>
       </w:r>
       <w:r>
-        <w:t xml:space="preserve"> of every value at both layers.</w:t>
-      </w:r>
-    </w:p>
-    <w:p>
-      <w:pPr>
-        <w:pStyle w:val="ListBullet"/>
-      </w:pPr>
+        <w:t xml:space="preserve"> of every value at both layers, plus </w:t>
+      </w:r>
       <w:r>
         <w:rPr>
           <w:b/>
         </w:rPr>
-        <w:t>Per-GUC cooldown</w:t>
-      </w:r>
-      <w:r>
-        <w:t xml:space="preserve"> (</w:t>
+        <w:t>bounds validation</w:t>
+      </w:r>
+      <w:r>
+        <w:t xml:space="preserve">: the SQL policy never enqueues a value outside the GUC's own </w:t>
       </w:r>
       <w:r>
         <w:rPr>
@@ -1987,10 +2042,57 @@
           <w:color w:val="1F3B6E"/>
           <w:sz w:val="19"/>
         </w:rPr>
-        <w:t>global_change_cooldown_seconds</w:t>
-      </w:r>
-      <w:r>
-        <w:t>, default 600 s) plus deduplication and a no-op filter (a change equal to the current value is never enqueued).</w:t>
+        <w:t>pg_settings</w:t>
+      </w:r>
+      <w:r>
+        <w:t xml:space="preserve"> min/max, the </w:t>
+      </w:r>
+      <w:r>
+        <w:rPr>
+          <w:rFonts w:ascii="Consolas" w:hAnsi="Consolas"/>
+          <w:color w:val="1F3B6E"/>
+          <w:sz w:val="19"/>
+        </w:rPr>
+        <w:t>policy</w:t>
+      </w:r>
+      <w:r>
+        <w:t xml:space="preserve"> table's CHECK constraints cap every knob that feeds a bounded setting at that setting's documented maximum (cost limits ≤ 10000, delays ≤ 100 ms, scale factors ≤ 100, work_mem below the kilobyte-conversion overflow), and the C applier isolates each queue row in a subtransaction — a value the server rejects is marked failed individually instead of aborting the whole apply cycle and being retried until expiry. One constraint the server does NOT reject is enforced explicitly at apply time: </w:t>
+      </w:r>
+      <w:r>
+        <w:rPr>
+          <w:rFonts w:ascii="Consolas" w:hAnsi="Consolas"/>
+          <w:color w:val="1F3B6E"/>
+          <w:sz w:val="19"/>
+        </w:rPr>
+        <w:t>autovacuum_max_workers</w:t>
+      </w:r>
+      <w:r>
+        <w:t xml:space="preserve"> above </w:t>
+      </w:r>
+      <w:r>
+        <w:rPr>
+          <w:rFonts w:ascii="Consolas" w:hAnsi="Consolas"/>
+          <w:color w:val="1F3B6E"/>
+          <w:sz w:val="19"/>
+        </w:rPr>
+        <w:t>autovacuum_worker_slots</w:t>
+      </w:r>
+      <w:r>
+        <w:t xml:space="preserve"> is merely warned about and capped at runtime, so the applier fails such a row itself — the policy caps its own recommendation, but a queued row can outlive a restart that lowered the slot count, and manual queue inserts bypass the policy.</w:t>
+      </w:r>
+    </w:p>
+    <w:p>
+      <w:pPr>
+        <w:pStyle w:val="ListBullet"/>
+      </w:pPr>
+      <w:r>
+        <w:rPr>
+          <w:b/>
+        </w:rPr>
+        <w:t>Deduplication and a no-op filter</w:t>
+      </w:r>
+      <w:r>
+        <w:t>: at most one pending change per GUC, and a change equal to the current value is never enqueued. Pacing comes from the cycle naptime and the at-most-doubling step, not from a timer — a per-GUC cooldown was removed because it starved correlated settings (a workers-only raise dilutes the unchanged cost limit across more workers).</w:t>
       </w:r>
     </w:p>
     <w:p>

</xml_diff>